<commit_message>
Docs refresh after the security assessment; team-size guidance
- Feature and Technical Guides (Word) v1.1: server-side check, fail-closed auth, rate limits,
  setup code on Docker, admin protections and audit log, upload limits, Docker hardening,
  AWS monitoring/backups, a new Operating an installation section, corrected retrieval thresholds
- README, SECURITY, AGENTS status, on-prem and AWS guides, infra README, feature and technical
  briefs: 1 to 25 people recommended, up to about 100 (Lambda concurrency quota, admins, spend)

Co-Authored-By: Claude Opus 5.5 <noreply@anthropic.com>
</commit_message>
<xml_diff>
--- a/docs/SecureMind-Feature-Guide.docx
+++ b/docs/SecureMind-Feature-Guide.docx
@@ -89,7 +89,7 @@
           <w:color w:val="5B4DB8"/>
           <w:sz w:val="22"/>
         </w:rPr>
-        <w:t>Version 1.0</w:t>
+        <w:t>Version 1.1</w:t>
       </w:r>
       <w:r>
         <w:rPr>
@@ -99,7 +99,7 @@
           <w:color w:val="5C616B"/>
           <w:sz w:val="22"/>
         </w:rPr>
-        <w:t xml:space="preserve">   ·   29 September 2026</w:t>
+        <w:t xml:space="preserve">   ·   19 October 2026</w:t>
       </w:r>
     </w:p>
     <w:p>
@@ -220,6 +220,21 @@
           <w:sz w:val="22"/>
         </w:rPr>
         <w:t>An administrator manages provider keys, access, and shared settings. Members use that setup and can have individual estimated spending caps. Stored application data is held within the installation’s environment. Configured external providers can still receive content needed for model responses, transcription, or other processing.</w:t>
+      </w:r>
+    </w:p>
+    <w:p>
+      <w:pPr>
+        <w:spacing w:before="0" w:after="160" w:line="276" w:lineRule="auto"/>
+      </w:pPr>
+      <w:r>
+        <w:rPr>
+          <w:rFonts w:ascii="Calibri" w:hAnsi="Calibri" w:eastAsia="Calibri"/>
+          <w:b w:val="0"/>
+          <w:i w:val="0"/>
+          <w:color w:val="1A1C1F"/>
+          <w:sz w:val="22"/>
+        </w:rPr>
+        <w:t>SecureMind is intended for small to mid-sized teams. One installation serves one organization: 1 to 25 people is the recommended range, and it can serve up to about 100 people with a few adjustments, mainly an AWS concurrency limit and a realistic budget. The technical guide lists them. Separate organizations should each run their own installation.</w:t>
       </w:r>
     </w:p>
     <w:p>
@@ -1720,6 +1735,21 @@
     </w:p>
     <w:p>
       <w:pPr>
+        <w:spacing w:before="0" w:after="160" w:line="276" w:lineRule="auto"/>
+      </w:pPr>
+      <w:r>
+        <w:rPr>
+          <w:rFonts w:ascii="Calibri" w:hAnsi="Calibri" w:eastAsia="Calibri"/>
+          <w:b w:val="0"/>
+          <w:i w:val="0"/>
+          <w:color w:val="1A1C1F"/>
+          <w:sz w:val="22"/>
+        </w:rPr>
+        <w:t>Docker builds SecureMind from the source you download, and by default it is reachable only from that computer. The first account needs a one-time setup code, which the installation prints when it starts. To use it from other computers on your network, add the included HTTPS front end and a firewall. Docker is meant for a computer or a private network, not for the public internet.</w:t>
+      </w:r>
+    </w:p>
+    <w:p>
+      <w:pPr>
         <w:pStyle w:val="Heading2"/>
         <w:spacing w:before="240" w:after="80"/>
       </w:pPr>
@@ -1746,6 +1776,21 @@
           <w:sz w:val="22"/>
         </w:rPr>
         <w:t>The cloud option runs in the administrator’s own AWS environment. The region is set in the infrastructure configuration. The in-app setup wizard does not ask for a region. Ollama is not part of SecureMind’s cloud configuration. Provider availability and any cross-region processing depend on the services and models configured.</w:t>
+      </w:r>
+    </w:p>
+    <w:p>
+      <w:pPr>
+        <w:spacing w:before="0" w:after="160" w:line="276" w:lineRule="auto"/>
+      </w:pPr>
+      <w:r>
+        <w:rPr>
+          <w:rFonts w:ascii="Calibri" w:hAnsi="Calibri" w:eastAsia="Calibri"/>
+          <w:b w:val="0"/>
+          <w:i w:val="0"/>
+          <w:color w:val="1A1C1F"/>
+          <w:sz w:val="22"/>
+        </w:rPr>
+        <w:t>The cloud option includes backups of the data (point-in-time recovery), protection against deleting the database or the user directory by mistake, an AWS activity trail, alarms, and a monthly budget alert sent to an email the administrator chooses. Sign-in is invite-only and is checked again at the API before any chat runs.</w:t>
       </w:r>
     </w:p>
     <w:p>
@@ -1940,7 +1985,7 @@
           <w:color w:val="1A1C1F"/>
           <w:sz w:val="22"/>
         </w:rPr>
-        <w:t>The normal path does not send the original detected value. Detection is best effort: a value that is not detected may remain in the submitted text. A request that skips the browser can also skip this review. The scan is risk reduction, not a guarantee.</w:t>
+        <w:t>The normal path does not send the original detected value. Detection is best effort: a value that is not detected may remain in the submitted text. A request that skips the browser skips this review, so the server checks every chat message again for the highest-risk values (social security and social insurance numbers, card numbers and secrets) and replaces them. Other details are reviewed in the browser only. The scan is risk reduction, not a guarantee.</w:t>
       </w:r>
     </w:p>
     <w:p>
@@ -4503,6 +4548,21 @@
           <w:color w:val="1A1C1F"/>
           <w:sz w:val="22"/>
         </w:rPr>
+        <w:t>Only the Owner can change another administrator’s role, status, password, or two-step verification, so one administrator cannot take over another. A suspended person is signed out within seconds. Every administrative change is kept in an audit log. Setting a member’s password lets an administrator sign in as that member, so keep the number of administrators small and have them turn on two-step verification.</w:t>
+      </w:r>
+    </w:p>
+    <w:p>
+      <w:pPr>
+        <w:spacing w:before="0" w:after="160" w:line="276" w:lineRule="auto"/>
+      </w:pPr>
+      <w:r>
+        <w:rPr>
+          <w:rFonts w:ascii="Calibri" w:hAnsi="Calibri" w:eastAsia="Calibri"/>
+          <w:b w:val="0"/>
+          <w:i w:val="0"/>
+          <w:color w:val="1A1C1F"/>
+          <w:sz w:val="22"/>
+        </w:rPr>
         <w:t>Cost caps are precautionary limits based on estimated use. The application blocks covered billable requests when the estimate reaches the cap. Administrators should still review actual charges with the provider. These limits are not provider-enforced billing budgets.</w:t>
       </w:r>
     </w:p>
@@ -4703,7 +4763,7 @@
           <w:color w:val="1A1C1F"/>
           <w:sz w:val="22"/>
         </w:rPr>
-        <w:t>Detection is best effort. A value that is not detected may be processed or stored. Browser review is the path inside the application. It is not protection against a request that bypasses that path.</w:t>
+        <w:t>Detection is best effort. A value that is not detected may be processed or stored. Browser review is the path inside the application. For a request that bypasses it, the server catches only the highest-risk values, not every category.</w:t>
       </w:r>
     </w:p>
     <w:p>
@@ -4733,7 +4793,7 @@
           <w:color w:val="1A1C1F"/>
           <w:sz w:val="22"/>
         </w:rPr>
-        <w:t>Each installation is independently operated. SecureMind is not intended to run a shared public service that holds every customer’s API keys. A region set for the deployment does not, by itself, mean that every connected service processes data only there.</w:t>
+        <w:t>Each installation is independently operated. SecureMind is not intended to run a shared public service that holds every customer’s API keys, and one installation is not a boundary between separate organizations. A region set for the deployment does not, by itself, mean that every connected service processes data only there. An AWS web application firewall is not included; an administrator can add one to their own account.</w:t>
       </w:r>
     </w:p>
     <w:p>
@@ -4783,7 +4843,7 @@
         <w:color w:val="5C616B"/>
         <w:sz w:val="18"/>
       </w:rPr>
-      <w:t>Version 1.0</w:t>
+      <w:t>Version 1.1</w:t>
     </w:r>
     <w:r>
       <w:tab/>
@@ -4870,7 +4930,7 @@
         <w:color w:val="5C616B"/>
         <w:sz w:val="18"/>
       </w:rPr>
-      <w:t>Version  1.0</w:t>
+      <w:t>Version  1.1</w:t>
     </w:r>
   </w:p>
 </w:hdr>

</xml_diff>

<commit_message>
Word guides: bring both fully up to date (version 1.2)
Feature Guide: files from chat, task models, first-visit tour, portal name
and logo, retired-model unlisting, score card, account security and
two-step verification, voice captions and cost cap, Usage in Insights,
admin add/restore user.

Technical Guide: routing section rewritten to the current signal table,
carry-over and evidence floors; turn policy for terse fragments; wider
server-side check; retired models; task models; files from chat; direct
live captions (ADR 0009); voice cost; unzip cap; hosted changes (plan role,
log retention, deletion protection); rules table extended.

Co-Authored-By: Claude Sonnet 5.5 <noreply@anthropic.com>
</commit_message>
<xml_diff>
--- a/docs/SecureMind-Feature-Guide.docx
+++ b/docs/SecureMind-Feature-Guide.docx
@@ -89,7 +89,7 @@
           <w:color w:val="5B4DB8"/>
           <w:sz w:val="22"/>
         </w:rPr>
-        <w:t>Version 1.1</w:t>
+        <w:t>Version 1.2</w:t>
       </w:r>
       <w:r>
         <w:rPr>
@@ -99,7 +99,7 @@
           <w:color w:val="5C616B"/>
           <w:sz w:val="22"/>
         </w:rPr>
-        <w:t xml:space="preserve">   ·   19 October 2026</w:t>
+        <w:t xml:space="preserve">   ·   25 October 2026</w:t>
       </w:r>
     </w:p>
     <w:p>
@@ -1418,6 +1418,216 @@
                 <w:color w:val="1A1C1F"/>
                 <w:sz w:val="20"/>
               </w:rPr>
+              <w:t>Score card</w:t>
+            </w:r>
+          </w:p>
+        </w:tc>
+        <w:tc>
+          <w:tcPr>
+            <w:tcW w:type="dxa" w:w="7056"/>
+            <w:tcBorders>
+              <w:top w:val="single" w:sz="4" w:color="D0D3DA"/>
+              <w:left w:val="single" w:sz="4" w:color="D0D3DA"/>
+              <w:bottom w:val="single" w:sz="4" w:color="D0D3DA"/>
+              <w:right w:val="single" w:sz="4" w:color="D0D3DA"/>
+            </w:tcBorders>
+            <w:tcMar>
+              <w:top w:w="80" w:type="dxa"/>
+              <w:left w:w="80" w:type="dxa"/>
+              <w:bottom w:w="80" w:type="dxa"/>
+              <w:right w:w="80" w:type="dxa"/>
+            </w:tcMar>
+            <w:shd w:fill="F4F5F7" w:val="clear"/>
+          </w:tcPr>
+          <w:p>
+            <w:pPr>
+              <w:spacing w:before="20" w:after="20"/>
+            </w:pPr>
+            <w:r/>
+            <w:r>
+              <w:rPr>
+                <w:rFonts w:ascii="Calibri" w:hAnsi="Calibri" w:eastAsia="Calibri"/>
+                <w:b w:val="0"/>
+                <w:i w:val="0"/>
+                <w:color w:val="1A1C1F"/>
+                <w:sz w:val="20"/>
+              </w:rPr>
+              <w:t>The "Why this tier?" link under a reply. It lists the signals that raised or lowered the score, any adjustment, and the tier that ran.</w:t>
+            </w:r>
+          </w:p>
+        </w:tc>
+      </w:tr>
+      <w:tr>
+        <w:tc>
+          <w:tcPr>
+            <w:tcW w:type="dxa" w:w="2448"/>
+            <w:tcBorders>
+              <w:top w:val="single" w:sz="4" w:color="D0D3DA"/>
+              <w:left w:val="single" w:sz="4" w:color="D0D3DA"/>
+              <w:bottom w:val="single" w:sz="4" w:color="D0D3DA"/>
+              <w:right w:val="single" w:sz="4" w:color="D0D3DA"/>
+            </w:tcBorders>
+            <w:tcMar>
+              <w:top w:w="80" w:type="dxa"/>
+              <w:left w:w="80" w:type="dxa"/>
+              <w:bottom w:w="80" w:type="dxa"/>
+              <w:right w:w="80" w:type="dxa"/>
+            </w:tcMar>
+            <w:shd w:fill="EEF0F3" w:val="clear"/>
+          </w:tcPr>
+          <w:p>
+            <w:pPr>
+              <w:spacing w:before="20" w:after="20"/>
+            </w:pPr>
+            <w:r/>
+            <w:r>
+              <w:rPr>
+                <w:rFonts w:ascii="Calibri" w:hAnsi="Calibri" w:eastAsia="Calibri"/>
+                <w:b/>
+                <w:i w:val="0"/>
+                <w:color w:val="1A1C1F"/>
+                <w:sz w:val="20"/>
+              </w:rPr>
+              <w:t>Task model</w:t>
+            </w:r>
+          </w:p>
+        </w:tc>
+        <w:tc>
+          <w:tcPr>
+            <w:tcW w:type="dxa" w:w="7056"/>
+            <w:tcBorders>
+              <w:top w:val="single" w:sz="4" w:color="D0D3DA"/>
+              <w:left w:val="single" w:sz="4" w:color="D0D3DA"/>
+              <w:bottom w:val="single" w:sz="4" w:color="D0D3DA"/>
+              <w:right w:val="single" w:sz="4" w:color="D0D3DA"/>
+            </w:tcBorders>
+            <w:tcMar>
+              <w:top w:w="80" w:type="dxa"/>
+              <w:left w:w="80" w:type="dxa"/>
+              <w:bottom w:w="80" w:type="dxa"/>
+              <w:right w:w="80" w:type="dxa"/>
+            </w:tcMar>
+            <w:shd w:fill="EEF0F3" w:val="clear"/>
+          </w:tcPr>
+          <w:p>
+            <w:pPr>
+              <w:spacing w:before="20" w:after="20"/>
+            </w:pPr>
+            <w:r/>
+            <w:r>
+              <w:rPr>
+                <w:rFonts w:ascii="Calibri" w:hAnsi="Calibri" w:eastAsia="Calibri"/>
+                <w:b w:val="0"/>
+                <w:i w:val="0"/>
+                <w:color w:val="1A1C1F"/>
+                <w:sz w:val="20"/>
+              </w:rPr>
+              <w:t>A helper model an administrator approves for one narrow job, such as turning a reply into a file. It is off until chosen.</w:t>
+            </w:r>
+          </w:p>
+        </w:tc>
+      </w:tr>
+      <w:tr>
+        <w:tc>
+          <w:tcPr>
+            <w:tcW w:type="dxa" w:w="2448"/>
+            <w:tcBorders>
+              <w:top w:val="single" w:sz="4" w:color="D0D3DA"/>
+              <w:left w:val="single" w:sz="4" w:color="D0D3DA"/>
+              <w:bottom w:val="single" w:sz="4" w:color="D0D3DA"/>
+              <w:right w:val="single" w:sz="4" w:color="D0D3DA"/>
+            </w:tcBorders>
+            <w:tcMar>
+              <w:top w:w="80" w:type="dxa"/>
+              <w:left w:w="80" w:type="dxa"/>
+              <w:bottom w:w="80" w:type="dxa"/>
+              <w:right w:w="80" w:type="dxa"/>
+            </w:tcMar>
+            <w:shd w:fill="F4F5F7" w:val="clear"/>
+          </w:tcPr>
+          <w:p>
+            <w:pPr>
+              <w:spacing w:before="20" w:after="20"/>
+            </w:pPr>
+            <w:r/>
+            <w:r>
+              <w:rPr>
+                <w:rFonts w:ascii="Calibri" w:hAnsi="Calibri" w:eastAsia="Calibri"/>
+                <w:b/>
+                <w:i w:val="0"/>
+                <w:color w:val="1A1C1F"/>
+                <w:sz w:val="20"/>
+              </w:rPr>
+              <w:t>Portal</w:t>
+            </w:r>
+          </w:p>
+        </w:tc>
+        <w:tc>
+          <w:tcPr>
+            <w:tcW w:type="dxa" w:w="7056"/>
+            <w:tcBorders>
+              <w:top w:val="single" w:sz="4" w:color="D0D3DA"/>
+              <w:left w:val="single" w:sz="4" w:color="D0D3DA"/>
+              <w:bottom w:val="single" w:sz="4" w:color="D0D3DA"/>
+              <w:right w:val="single" w:sz="4" w:color="D0D3DA"/>
+            </w:tcBorders>
+            <w:tcMar>
+              <w:top w:w="80" w:type="dxa"/>
+              <w:left w:w="80" w:type="dxa"/>
+              <w:bottom w:w="80" w:type="dxa"/>
+              <w:right w:w="80" w:type="dxa"/>
+            </w:tcMar>
+            <w:shd w:fill="F4F5F7" w:val="clear"/>
+          </w:tcPr>
+          <w:p>
+            <w:pPr>
+              <w:spacing w:before="20" w:after="20"/>
+            </w:pPr>
+            <w:r/>
+            <w:r>
+              <w:rPr>
+                <w:rFonts w:ascii="Calibri" w:hAnsi="Calibri" w:eastAsia="Calibri"/>
+                <w:b w:val="0"/>
+                <w:i w:val="0"/>
+                <w:color w:val="1A1C1F"/>
+                <w:sz w:val="20"/>
+              </w:rPr>
+              <w:t>The logo, name, and short phrase in the top-left of the workspace, set by an administrator.</w:t>
+            </w:r>
+          </w:p>
+        </w:tc>
+      </w:tr>
+      <w:tr>
+        <w:tc>
+          <w:tcPr>
+            <w:tcW w:type="dxa" w:w="2448"/>
+            <w:tcBorders>
+              <w:top w:val="single" w:sz="4" w:color="D0D3DA"/>
+              <w:left w:val="single" w:sz="4" w:color="D0D3DA"/>
+              <w:bottom w:val="single" w:sz="4" w:color="D0D3DA"/>
+              <w:right w:val="single" w:sz="4" w:color="D0D3DA"/>
+            </w:tcBorders>
+            <w:tcMar>
+              <w:top w:w="80" w:type="dxa"/>
+              <w:left w:w="80" w:type="dxa"/>
+              <w:bottom w:w="80" w:type="dxa"/>
+              <w:right w:w="80" w:type="dxa"/>
+            </w:tcMar>
+            <w:shd w:fill="EEF0F3" w:val="clear"/>
+          </w:tcPr>
+          <w:p>
+            <w:pPr>
+              <w:spacing w:before="20" w:after="20"/>
+            </w:pPr>
+            <w:r/>
+            <w:r>
+              <w:rPr>
+                <w:rFonts w:ascii="Calibri" w:hAnsi="Calibri" w:eastAsia="Calibri"/>
+                <w:b/>
+                <w:i w:val="0"/>
+                <w:color w:val="1A1C1F"/>
+                <w:sz w:val="20"/>
+              </w:rPr>
               <w:t>Cost estimate</w:t>
             </w:r>
           </w:p>
@@ -1437,7 +1647,7 @@
               <w:bottom w:w="80" w:type="dxa"/>
               <w:right w:w="80" w:type="dxa"/>
             </w:tcMar>
-            <w:shd w:fill="F4F5F7" w:val="clear"/>
+            <w:shd w:fill="EEF0F3" w:val="clear"/>
           </w:tcPr>
           <w:p>
             <w:pPr>
@@ -1473,7 +1683,7 @@
               <w:bottom w:w="80" w:type="dxa"/>
               <w:right w:w="80" w:type="dxa"/>
             </w:tcMar>
-            <w:shd w:fill="EEF0F3" w:val="clear"/>
+            <w:shd w:fill="F4F5F7" w:val="clear"/>
           </w:tcPr>
           <w:p>
             <w:pPr>
@@ -1507,7 +1717,7 @@
               <w:bottom w:w="80" w:type="dxa"/>
               <w:right w:w="80" w:type="dxa"/>
             </w:tcMar>
-            <w:shd w:fill="EEF0F3" w:val="clear"/>
+            <w:shd w:fill="F4F5F7" w:val="clear"/>
           </w:tcPr>
           <w:p>
             <w:pPr>
@@ -1660,7 +1870,37 @@
           <w:color w:val="1A1C1F"/>
           <w:sz w:val="22"/>
         </w:rPr>
-        <w:t>Voice input uses a configured transcription service: Amazon Transcribe or Groq Whisper. The transcript appears in the composer for review before sending. For hosted transcription, audio is sent to the selected service before the resulting text can be scanned. On the hosted edition with Amazon Transcribe, words appear while you speak, a session ends after ten minutes, and voice counts toward the monthly cost cap.</w:t>
+        <w:t>Voice input uses a configured transcription service: Amazon Transcribe or Groq Whisper. The transcript appears in the composer for review before sending. For hosted transcription, audio is sent to the selected service before the resulting text can be scanned. On the hosted edition with Amazon Transcribe, words appear while you speak, a session ends after ten minutes, and voice counts toward the monthly cost cap and is refused once a person is over it. Your browser connects to Amazon Transcribe with a short-lived address that the server signs, so the audio does not pass through the SecureMind server. If live captions fail for any reason, the whole recording is transcribed in one pass when you press the tick.</w:t>
+      </w:r>
+    </w:p>
+    <w:p>
+      <w:pPr>
+        <w:pStyle w:val="Heading2"/>
+        <w:spacing w:before="240" w:after="80"/>
+      </w:pPr>
+      <w:r>
+        <w:rPr>
+          <w:rFonts w:ascii="Calibri" w:hAnsi="Calibri" w:eastAsia="Calibri"/>
+          <w:b/>
+          <w:color w:val="3A3278"/>
+          <w:sz w:val="26"/>
+        </w:rPr>
+        <w:t>Task models</w:t>
+      </w:r>
+    </w:p>
+    <w:p>
+      <w:pPr>
+        <w:spacing w:before="0" w:after="160" w:line="276" w:lineRule="auto"/>
+      </w:pPr>
+      <w:r>
+        <w:rPr>
+          <w:rFonts w:ascii="Calibri" w:hAnsi="Calibri" w:eastAsia="Calibri"/>
+          <w:b w:val="0"/>
+          <w:i w:val="0"/>
+          <w:color w:val="1A1C1F"/>
+          <w:sz w:val="22"/>
+        </w:rPr>
+        <w:t>Chat chooses a model by complexity tier. A task model is separate: a helper an administrator approves for one narrow job. The one job today is building a downloadable file when the chat model did not produce the file format. It is off until an administrator chooses a model under Settings, Models. It always uses exactly the model that was chosen, and never falls back to another provider. It sees only the reply text, after card numbers, social security numbers and secrets have been replaced, and a vendor model needs the vendor notice accepted first.</w:t>
       </w:r>
     </w:p>
     <w:p>
@@ -2030,6 +2270,36 @@
           <w:color w:val="1A1C1F"/>
           <w:sz w:val="22"/>
         </w:rPr>
+        <w:t>Every reply carries a "Why this tier?" link. It opens a score card: the baseline, each signal that fired with its points, any adjustment, and the tier that ran. No message text is stored on the card. A message that is answered from your documents is never run on the cheapest tiers: a short question about a document runs on at least Standard, and a summary or analysis across documents runs on at least Plus.</w:t>
+      </w:r>
+    </w:p>
+    <w:p>
+      <w:pPr>
+        <w:spacing w:before="0" w:after="160" w:line="276" w:lineRule="auto"/>
+      </w:pPr>
+      <w:r>
+        <w:rPr>
+          <w:rFonts w:ascii="Calibri" w:hAnsi="Calibri" w:eastAsia="Calibri"/>
+          <w:b w:val="0"/>
+          <w:i w:val="0"/>
+          <w:color w:val="1A1C1F"/>
+          <w:sz w:val="22"/>
+        </w:rPr>
+        <w:t>If a provider retires a model, the next reply that picks it fails with the provider's answer. SecureMind then takes that model off the chat menus, says so in the reply, and leaves it off until a later Test passes. A temporary problem such as a rate limit or an outage does not unlist anything.</w:t>
+      </w:r>
+    </w:p>
+    <w:p>
+      <w:pPr>
+        <w:spacing w:before="0" w:after="160" w:line="276" w:lineRule="auto"/>
+      </w:pPr>
+      <w:r>
+        <w:rPr>
+          <w:rFonts w:ascii="Calibri" w:hAnsi="Calibri" w:eastAsia="Calibri"/>
+          <w:b w:val="0"/>
+          <w:i w:val="0"/>
+          <w:color w:val="1A1C1F"/>
+          <w:sz w:val="22"/>
+        </w:rPr>
         <w:t>The technical guide explains the routing rules, which parts of the conversation influence the decision, and how the application handles an unavailable model. This guide does not restate those rules.</w:t>
       </w:r>
     </w:p>
@@ -2120,6 +2390,81 @@
     </w:p>
     <w:p>
       <w:pPr>
+        <w:pStyle w:val="Heading2"/>
+        <w:spacing w:before="240" w:after="80"/>
+      </w:pPr>
+      <w:r>
+        <w:rPr>
+          <w:rFonts w:ascii="Calibri" w:hAnsi="Calibri" w:eastAsia="Calibri"/>
+          <w:b/>
+          <w:color w:val="3A3278"/>
+          <w:sz w:val="26"/>
+        </w:rPr>
+        <w:t>Files from chat</w:t>
+      </w:r>
+    </w:p>
+    <w:p>
+      <w:pPr>
+        <w:spacing w:before="0" w:after="160" w:line="276" w:lineRule="auto"/>
+      </w:pPr>
+      <w:r>
+        <w:rPr>
+          <w:rFonts w:ascii="Calibri" w:hAnsi="Calibri" w:eastAsia="Calibri"/>
+          <w:b w:val="0"/>
+          <w:i w:val="0"/>
+          <w:color w:val="1A1C1F"/>
+          <w:sz w:val="22"/>
+        </w:rPr>
+        <w:t>Ask for a file, such as an Excel spreadsheet, a Word document, a CSV or a Markdown note, and the reply carries a file card with a Download button. The browser builds the file when you press Download. Nothing is stored on the server. File names are cleaned, anything that would run when opened is saved as a plain text file, spreadsheet cells that look like formulas are written as text, and a file over 2 MB is refused.</w:t>
+      </w:r>
+    </w:p>
+    <w:p>
+      <w:pPr>
+        <w:spacing w:before="0" w:after="160" w:line="276" w:lineRule="auto"/>
+      </w:pPr>
+      <w:r>
+        <w:rPr>
+          <w:rFonts w:ascii="Calibri" w:hAnsi="Calibri" w:eastAsia="Calibri"/>
+          <w:b w:val="0"/>
+          <w:i w:val="0"/>
+          <w:color w:val="1A1C1F"/>
+          <w:sz w:val="22"/>
+        </w:rPr>
+        <w:t>If the model did not write the file format, the browser first tries to build a file from the reply itself, such as a table or a document. Only when that finds nothing, and an administrator has approved a task model, does the helper build it. A request for a file changes the shape of the reply. It does not change what is searched or which tier runs.</w:t>
+      </w:r>
+    </w:p>
+    <w:p>
+      <w:pPr>
+        <w:pStyle w:val="Heading2"/>
+        <w:spacing w:before="240" w:after="80"/>
+      </w:pPr>
+      <w:r>
+        <w:rPr>
+          <w:rFonts w:ascii="Calibri" w:hAnsi="Calibri" w:eastAsia="Calibri"/>
+          <w:b/>
+          <w:color w:val="3A3278"/>
+          <w:sz w:val="26"/>
+        </w:rPr>
+        <w:t>A member's first visit</w:t>
+      </w:r>
+    </w:p>
+    <w:p>
+      <w:pPr>
+        <w:spacing w:before="0" w:after="160" w:line="276" w:lineRule="auto"/>
+      </w:pPr>
+      <w:r>
+        <w:rPr>
+          <w:rFonts w:ascii="Calibri" w:hAnsi="Calibri" w:eastAsia="Calibri"/>
+          <w:b w:val="0"/>
+          <w:i w:val="0"/>
+          <w:color w:val="1A1C1F"/>
+          <w:sz w:val="22"/>
+        </w:rPr>
+        <w:t>A member's first workspace opens with a short welcome, and a Take the tour button walks through the main areas. The button stops appearing after three visits, or sooner if you close it.</w:t>
+      </w:r>
+    </w:p>
+    <w:p>
+      <w:pPr>
         <w:pStyle w:val="Heading1"/>
         <w:spacing w:before="320" w:after="120"/>
       </w:pPr>
@@ -2200,6 +2545,21 @@
           <w:color w:val="1A1C1F"/>
           <w:sz w:val="22"/>
         </w:rPr>
+        <w:t>Uploads are limited before any parser runs: a file is at most 10 MB, and a Word or Excel file is opened with a hard cap on how large it may unpack, so a file that lies about its size is refused. Each person can add a limited number of files a day and store a limited total.</w:t>
+      </w:r>
+    </w:p>
+    <w:p>
+      <w:pPr>
+        <w:spacing w:before="0" w:after="160" w:line="276" w:lineRule="auto"/>
+      </w:pPr>
+      <w:r>
+        <w:rPr>
+          <w:rFonts w:ascii="Calibri" w:hAnsi="Calibri" w:eastAsia="Calibri"/>
+          <w:b w:val="0"/>
+          <w:i w:val="0"/>
+          <w:color w:val="1A1C1F"/>
+          <w:sz w:val="22"/>
+        </w:rPr>
         <w:t>When an answer uses retrieved material, it can identify the supporting source or passage. Source references help users inspect the basis of an answer. They do not guarantee that the answer is correct.</w:t>
       </w:r>
     </w:p>
@@ -2410,7 +2770,7 @@
           <w:color w:val="1A1C1F"/>
           <w:sz w:val="22"/>
         </w:rPr>
-        <w:t>Insights is the right-hand panel beside chat, with Models, Security, and Cost. It is one of SecureMind’s main transparency features. Collapse it when you want more room for the conversation.</w:t>
+        <w:t>Insights is the right-hand panel beside chat, with Models, Usage, Cost, and Security. Each opens a full page for the longer view. It is one of SecureMind’s main transparency features. Collapse it when you want more room for the conversation.</w:t>
       </w:r>
     </w:p>
     <w:p>
@@ -2525,7 +2885,7 @@
           <w:color w:val="1A1C1F"/>
           <w:sz w:val="22"/>
         </w:rPr>
-        <w:t>Cost provides an approximate breakdown of model API and Bedrock usage, using recorded activity and provider rates. It is useful for comparing models, observing spending trends, and judging an approximate spending range.</w:t>
+        <w:t>Cost provides an approximate breakdown of model API, Bedrock, and voice-transcription usage, using recorded activity and provider rates. Each estimate is raised by 10 percent and rounded up, so it tends high rather than low. It is useful for comparing models, observing spending trends, and judging an approximate spending range. The page also compares what you spent with what the same replies would have cost if every one had used the most expensive default tier. That gap is the routing saving. It is not money returned.</w:t>
       </w:r>
     </w:p>
     <w:p>
@@ -2555,7 +2915,7 @@
           <w:color w:val="1A1C1F"/>
           <w:sz w:val="22"/>
         </w:rPr>
-        <w:t>Per-user caps use these estimates as a precaution. When a configured threshold is reached, further billable model calls for that user stop. Ollama calls are not part of that cap. The cap cannot make the provider’s final bill equal the displayed estimate.</w:t>
+        <w:t>Per-user caps use these estimates as a precaution. When a configured threshold is reached, further billable model calls and voice sessions for that user stop. Ollama calls are not part of that cap. The cap cannot make the provider’s final bill equal the displayed estimate.</w:t>
       </w:r>
     </w:p>
     <w:p>
@@ -2741,6 +3101,51 @@
           <w:sz w:val="20"/>
         </w:rPr>
         <w:t>Settings, Models. Enable, Test, and Check access.</w:t>
+      </w:r>
+    </w:p>
+    <w:p>
+      <w:pPr>
+        <w:spacing w:before="0" w:after="160" w:line="276" w:lineRule="auto"/>
+      </w:pPr>
+      <w:r>
+        <w:rPr>
+          <w:rFonts w:ascii="Calibri" w:hAnsi="Calibri" w:eastAsia="Calibri"/>
+          <w:b w:val="0"/>
+          <w:i w:val="0"/>
+          <w:color w:val="1A1C1F"/>
+          <w:sz w:val="22"/>
+        </w:rPr>
+        <w:t>A model a provider has retired is taken off the chat menus automatically the first time a reply fails because of it, and it stays under the not-working group until a Test passes.</w:t>
+      </w:r>
+    </w:p>
+    <w:p>
+      <w:pPr>
+        <w:pStyle w:val="Heading2"/>
+        <w:spacing w:before="240" w:after="80"/>
+      </w:pPr>
+      <w:r>
+        <w:rPr>
+          <w:rFonts w:ascii="Calibri" w:hAnsi="Calibri" w:eastAsia="Calibri"/>
+          <w:b/>
+          <w:color w:val="3A3278"/>
+          <w:sz w:val="26"/>
+        </w:rPr>
+        <w:t>Task models</w:t>
+      </w:r>
+    </w:p>
+    <w:p>
+      <w:pPr>
+        <w:spacing w:before="0" w:after="160" w:line="276" w:lineRule="auto"/>
+      </w:pPr>
+      <w:r>
+        <w:rPr>
+          <w:rFonts w:ascii="Calibri" w:hAnsi="Calibri" w:eastAsia="Calibri"/>
+          <w:b w:val="0"/>
+          <w:i w:val="0"/>
+          <w:color w:val="1A1C1F"/>
+          <w:sz w:val="22"/>
+        </w:rPr>
+        <w:t>Under Settings, Models, an administrator can approve a helper model for building files, as described in section 4. The setting is off by default. Voice transcription is chosen in the same panel.</w:t>
       </w:r>
     </w:p>
     <w:p>
@@ -4413,6 +4818,21 @@
     </w:p>
     <w:p>
       <w:pPr>
+        <w:spacing w:before="0" w:after="160" w:line="276" w:lineRule="auto"/>
+      </w:pPr>
+      <w:r>
+        <w:rPr>
+          <w:rFonts w:ascii="Calibri" w:hAnsi="Calibri" w:eastAsia="Calibri"/>
+          <w:b w:val="0"/>
+          <w:i w:val="0"/>
+          <w:color w:val="1A1C1F"/>
+          <w:sz w:val="22"/>
+        </w:rPr>
+        <w:t>Two-step verification is optional and uses real Amazon Cognito, so it is available on the hosted edition. The local Docker sign-in does not support codes, and the page hides the control there. You set it up by scanning a QR code and typing a code to confirm. At sign-in, after your password, you type the six-digit code. Turning it off needs your password again, and repeated wrong passwords are slowed down. Administrators see a recommendation until they turn it on, and the Owner can reset someone else’s second step from the Admin page if a phone is lost.</w:t>
+      </w:r>
+    </w:p>
+    <w:p>
+      <w:pPr>
         <w:pStyle w:val="Heading1"/>
         <w:spacing w:before="320" w:after="120"/>
       </w:pPr>
@@ -4568,6 +4988,36 @@
     </w:p>
     <w:p>
       <w:pPr>
+        <w:spacing w:before="0" w:after="160" w:line="276" w:lineRule="auto"/>
+      </w:pPr>
+      <w:r>
+        <w:rPr>
+          <w:rFonts w:ascii="Calibri" w:hAnsi="Calibri" w:eastAsia="Calibri"/>
+          <w:b w:val="0"/>
+          <w:i w:val="0"/>
+          <w:color w:val="1A1C1F"/>
+          <w:sz w:val="22"/>
+        </w:rPr>
+        <w:t>Add user creates an account with a password the administrator types or generates, and sends a welcome email when outgoing email is set up. A deleted person can be restored. A person who is deleted loses sign-in, but their workspaces, Knowledge and history are not erased.</w:t>
+      </w:r>
+    </w:p>
+    <w:p>
+      <w:pPr>
+        <w:spacing w:before="0" w:after="160" w:line="276" w:lineRule="auto"/>
+      </w:pPr>
+      <w:r>
+        <w:rPr>
+          <w:rFonts w:ascii="Calibri" w:hAnsi="Calibri" w:eastAsia="Calibri"/>
+          <w:b w:val="0"/>
+          <w:i w:val="0"/>
+          <w:color w:val="1A1C1F"/>
+          <w:sz w:val="22"/>
+        </w:rPr>
+        <w:t>The Portal card sets the logo, name, and short phrase shown in the top-left of the workspace. The sign-in page, the browser title, and email stay SecureMind.</w:t>
+      </w:r>
+    </w:p>
+    <w:p>
+      <w:pPr>
         <w:spacing w:before="40" w:after="160" w:line="259" w:lineRule="auto"/>
       </w:pPr>
       <w:r>
@@ -4643,7 +5093,7 @@
           <w:color w:val="1A1C1F"/>
           <w:sz w:val="22"/>
         </w:rPr>
-        <w:t>Getting started appears while chat is not ready. It points toward Settings, Setup, and Models: connect a model source, make a model available, and send a first message. Sensitive-data review and Insights are part of that introduction. The full setup steps are on the website, as described in section 5.</w:t>
+        <w:t>Getting started appears while chat is not ready. It points toward Settings, Setup, and Models: connect a model source, make a model available, and send a first message. Sensitive-data review and Insights are part of that introduction. A member who joins an installation that is already set up sees a short welcome and can take a tour. The full setup steps are on the website, as described in section 5.</w:t>
       </w:r>
     </w:p>
     <w:p>
@@ -4808,7 +5258,7 @@
           <w:color w:val="1A1C1F"/>
           <w:sz w:val="22"/>
         </w:rPr>
-        <w:t>SecureMind does not accept pasted AWS access keys. Local Bedrock uses the credential chain in section 4. Raw audio sent for hosted transcription is processed before the transcript can be reviewed and redacted.</w:t>
+        <w:t>SecureMind does not accept pasted AWS access keys. Local Bedrock uses the credential chain in section 4. Raw audio sent for hosted transcription is processed before the transcript can be reviewed and redacted. The model’s reply is not scanned for sensitive values, and a signed-in session stays valid until it expires, up to an hour, even after you sign out.</w:t>
       </w:r>
     </w:p>
     <w:sectPr>
@@ -4843,7 +5293,7 @@
         <w:color w:val="5C616B"/>
         <w:sz w:val="18"/>
       </w:rPr>
-      <w:t>Version 1.1</w:t>
+      <w:t>Version 1.2</w:t>
     </w:r>
     <w:r>
       <w:tab/>
@@ -4930,7 +5380,7 @@
         <w:color w:val="5C616B"/>
         <w:sz w:val="18"/>
       </w:rPr>
-      <w:t>Version  1.1</w:t>
+      <w:t>Version  1.2</w:t>
     </w:r>
   </w:p>
 </w:hdr>

</xml_diff>

<commit_message>
Rename the Saved feature to Bookmarks
The tab, home card, page, buttons and empty states now say Bookmarks,
matching the route (/api/bookmarks), the icon and the bookmarked flag.
"Saved" read like the verb used elsewhere (key saved, theme saved).
Docs and both Word guides are updated and rebuilt. The SavedItem table
keeps its name so existing rows need no migration.

Also commits the Next.js agent-rules block that next dev adds to AGENTS.md.

Co-Authored-By: Claude Opus 5.5 <noreply@anthropic.com>
</commit_message>
<xml_diff>
--- a/docs/SecureMind-Feature-Guide.docx
+++ b/docs/SecureMind-Feature-Guide.docx
@@ -264,7 +264,7 @@
           <w:color w:val="1A1C1F"/>
           <w:sz w:val="22"/>
         </w:rPr>
-        <w:t>Each section explains what a feature does and why it exists. Start with Workspaces and Chat for everyday use, then explore Knowledge, Memory, Saved, and Insights. Settings and the Admin console explain how the installation is configured and managed.</w:t>
+        <w:t>Each section explains what a feature does and why it exists. Start with Workspaces and Chat for everyday use, then explore Knowledge, Memory, Bookmarks, and Insights. Settings and the Admin console explain how the installation is configured and managed.</w:t>
       </w:r>
     </w:p>
     <w:p>
@@ -309,7 +309,7 @@
           <w:color w:val="1A1C1F"/>
           <w:sz w:val="22"/>
         </w:rPr>
-        <w:t>3 Terms and controls  ·  4 Connections and credentials  ·  5 Installation options  ·  6 Workspaces  ·  7 Chat  ·  8 Knowledge  ·  9 Memory  ·  10 Saved  ·  11 Insights  ·  12 Model settings  ·  13 Detection policy  ·  14 Profile and account security  ·  15 Appearance  ·  16 Admin console  ·  17 Getting started  ·  18 How the parts fit  ·  19 Scope and limitations</w:t>
+        <w:t>3 Terms and controls  ·  4 Connections and credentials  ·  5 Installation options  ·  6 Workspaces  ·  7 Chat  ·  8 Knowledge  ·  9 Memory  ·  10 Bookmarks  ·  11 Insights  ·  12 Model settings  ·  13 Detection policy  ·  14 Profile and account security  ·  15 Appearance  ·  16 Admin console  ·  17 Getting started  ·  18 How the parts fit  ·  19 Scope and limitations</w:t>
       </w:r>
     </w:p>
     <w:p>
@@ -2660,7 +2660,7 @@
           <w:color w:val="5B4DB8"/>
           <w:sz w:val="36"/>
         </w:rPr>
-        <w:t>10  Saved</w:t>
+        <w:t>10  Bookmarks</w:t>
       </w:r>
     </w:p>
     <w:p>
@@ -2700,7 +2700,7 @@
           <w:color w:val="1A1C1F"/>
           <w:sz w:val="22"/>
         </w:rPr>
-        <w:t>Save a message when you want to revisit it. Saved lists those bookmarks. Choosing one returns you to that message in the conversation and highlights it. You can also remove a bookmark.</w:t>
+        <w:t>Bookmark a message when you want to revisit it. Bookmarks lists them. Choosing one returns you to that message in the conversation and highlights it. You can also remove a bookmark.</w:t>
       </w:r>
     </w:p>
     <w:p>
@@ -5138,7 +5138,7 @@
           <w:color w:val="1A1C1F"/>
           <w:sz w:val="22"/>
         </w:rPr>
-        <w:t>Chat reviews typed text before processing. Knowledge supplies uploaded content. Memory retains what you wrote. Saved returns you to a message. A complexity tier or a fixed model determines which model answers. Insights shows the activity, the estimated cost, and the findings.</w:t>
+        <w:t>Chat reviews typed text before processing. Knowledge supplies uploaded content. Memory retains what you wrote. Bookmarks return you to a message. A complexity tier or a fixed model determines which model answers. Insights shows the activity, the estimated cost, and the findings.</w:t>
       </w:r>
     </w:p>
     <w:p>

</xml_diff>